<commit_message>
iva tasa baja y tasa alta agregados en cada producto y le avisa al cliente que tiene iva tambien en las facturaciones
</commit_message>
<xml_diff>
--- a/StockApp_Funcionalidades_para_Distribuidoras.docx
+++ b/StockApp_Funcionalidades_para_Distribuidoras.docx
@@ -160,6 +160,14 @@
           <w:szCs w:val="21"/>
         </w:rPr>
         <w:t xml:space="preserve">Desde tu panel, con tu usuario y contraseña, tenés acceso a todo lo necesario para manejar tu negocio dentro de la plataforma.</w:t>
+      </w:r>
+    </w:p>
+    <w:p>
+      <w:r>
+        <w:rPr>
+          <w:sz w:val="21"/>
+        </w:rPr>
+        <w:t>Además, tanto vos como tus clientes pueden instalar StockApp como una aplicación en el celular o la computadora (sin pasar por ninguna tienda de aplicaciones): se agrega un ícono a la pantalla de inicio y se abre directamente, sin la barra del navegador.</w:t>
       </w:r>
     </w:p>
     <w:p>
@@ -452,24 +460,86 @@
             <w:r>
               <w:rPr>
                 <w:b/>
+                <w:sz w:val="21"/>
+              </w:rPr>
+              <w:t>Cargar y editar productos</w:t>
+            </w:r>
+          </w:p>
+        </w:tc>
+        <w:tc>
+          <w:tcPr>
+            <w:tcW w:type="dxa" w:w="6890"/>
+            <w:tcBorders>
+              <w:top w:val="single" w:color="D1D5DB" w:sz="2"/>
+              <w:left w:val="single" w:color="D1D5DB" w:sz="2"/>
+              <w:bottom w:val="single" w:color="D1D5DB" w:sz="2"/>
+              <w:right w:val="single" w:color="D1D5DB" w:sz="2"/>
+            </w:tcBorders>
+            <w:tcMar>
+              <w:top w:type="dxa" w:w="100"/>
+              <w:left w:type="dxa" w:w="140"/>
+              <w:bottom w:type="dxa" w:w="100"/>
+              <w:right w:type="dxa" w:w="140"/>
+            </w:tcMar>
+          </w:tcPr>
+          <w:p>
+            <w:pPr>
+              <w:spacing w:line="280"/>
+            </w:pPr>
+            <w:r>
+              <w:rPr>
+                <w:b w:val="0"/>
+                <w:sz w:val="21"/>
+              </w:rPr>
+              <w:t>Nombre, código, marca, categoría, precio, tipo de IVA, stock y descripción — vos decidís qué mostrar y a qué precio.</w:t>
+            </w:r>
+          </w:p>
+        </w:tc>
+      </w:tr>
+      <w:tr>
+        <w:tc>
+          <w:tcPr>
+            <w:tcW w:type="dxa" w:w="2950"/>
+            <w:tcBorders>
+              <w:top w:val="single" w:color="D1D5DB" w:sz="2"/>
+              <w:left w:val="single" w:color="D1D5DB" w:sz="2"/>
+              <w:bottom w:val="single" w:color="D1D5DB" w:sz="2"/>
+              <w:right w:val="single" w:color="D1D5DB" w:sz="2"/>
+            </w:tcBorders>
+            <w:shd w:fill="F9FAFB" w:val="clear"/>
+            <w:tcMar>
+              <w:top w:type="dxa" w:w="100"/>
+              <w:left w:type="dxa" w:w="140"/>
+              <w:bottom w:type="dxa" w:w="100"/>
+              <w:right w:type="dxa" w:w="140"/>
+            </w:tcMar>
+          </w:tcPr>
+          <w:p>
+            <w:pPr>
+              <w:spacing w:line="280"/>
+            </w:pPr>
+            <w:r>
+              <w:rPr>
+                <w:b/>
                 <w:bCs/>
                 <w:color w:val="111827"/>
                 <w:sz w:val="20"/>
                 <w:szCs w:val="20"/>
               </w:rPr>
-              <w:t xml:space="preserve">Cargar y editar productos</w:t>
-            </w:r>
-          </w:p>
-        </w:tc>
-        <w:tc>
-          <w:tcPr>
-            <w:tcW w:type="dxa" w:w="6890"/>
-            <w:tcBorders>
-              <w:top w:val="single" w:color="D1D5DB" w:sz="2"/>
-              <w:left w:val="single" w:color="D1D5DB" w:sz="2"/>
-              <w:bottom w:val="single" w:color="D1D5DB" w:sz="2"/>
-              <w:right w:val="single" w:color="D1D5DB" w:sz="2"/>
-            </w:tcBorders>
+              <w:t xml:space="preserve">Actualizar stock al instante</w:t>
+            </w:r>
+          </w:p>
+        </w:tc>
+        <w:tc>
+          <w:tcPr>
+            <w:tcW w:type="dxa" w:w="6890"/>
+            <w:tcBorders>
+              <w:top w:val="single" w:color="D1D5DB" w:sz="2"/>
+              <w:left w:val="single" w:color="D1D5DB" w:sz="2"/>
+              <w:bottom w:val="single" w:color="D1D5DB" w:sz="2"/>
+              <w:right w:val="single" w:color="D1D5DB" w:sz="2"/>
+            </w:tcBorders>
+            <w:shd w:fill="F9FAFB" w:val="clear"/>
             <w:tcMar>
               <w:top w:type="dxa" w:w="100"/>
               <w:left w:type="dxa" w:w="140"/>
@@ -489,22 +559,21 @@
                 <w:sz w:val="20"/>
                 <w:szCs w:val="20"/>
               </w:rPr>
-              <w:t xml:space="preserve">Nombre, código, marca, categoría, precio, stock y descripción — vos decidís qué mostrar y a qué precio.</w:t>
-            </w:r>
-          </w:p>
-        </w:tc>
-      </w:tr>
-      <w:tr>
-        <w:tc>
-          <w:tcPr>
-            <w:tcW w:type="dxa" w:w="2950"/>
-            <w:tcBorders>
-              <w:top w:val="single" w:color="D1D5DB" w:sz="2"/>
-              <w:left w:val="single" w:color="D1D5DB" w:sz="2"/>
-              <w:bottom w:val="single" w:color="D1D5DB" w:sz="2"/>
-              <w:right w:val="single" w:color="D1D5DB" w:sz="2"/>
-            </w:tcBorders>
-            <w:shd w:fill="F9FAFB" w:val="clear"/>
+              <w:t xml:space="preserve">Podés editar el stock de un producto directamente desde el listado, sin abrir formularios.</w:t>
+            </w:r>
+          </w:p>
+        </w:tc>
+      </w:tr>
+      <w:tr>
+        <w:tc>
+          <w:tcPr>
+            <w:tcW w:type="dxa" w:w="2950"/>
+            <w:tcBorders>
+              <w:top w:val="single" w:color="D1D5DB" w:sz="2"/>
+              <w:left w:val="single" w:color="D1D5DB" w:sz="2"/>
+              <w:bottom w:val="single" w:color="D1D5DB" w:sz="2"/>
+              <w:right w:val="single" w:color="D1D5DB" w:sz="2"/>
+            </w:tcBorders>
             <w:tcMar>
               <w:top w:type="dxa" w:w="100"/>
               <w:left w:type="dxa" w:w="140"/>
@@ -524,20 +593,19 @@
                 <w:sz w:val="20"/>
                 <w:szCs w:val="20"/>
               </w:rPr>
-              <w:t xml:space="preserve">Actualizar stock al instante</w:t>
-            </w:r>
-          </w:p>
-        </w:tc>
-        <w:tc>
-          <w:tcPr>
-            <w:tcW w:type="dxa" w:w="6890"/>
-            <w:tcBorders>
-              <w:top w:val="single" w:color="D1D5DB" w:sz="2"/>
-              <w:left w:val="single" w:color="D1D5DB" w:sz="2"/>
-              <w:bottom w:val="single" w:color="D1D5DB" w:sz="2"/>
-              <w:right w:val="single" w:color="D1D5DB" w:sz="2"/>
-            </w:tcBorders>
-            <w:shd w:fill="F9FAFB" w:val="clear"/>
+              <w:t xml:space="preserve">Buscador interno</w:t>
+            </w:r>
+          </w:p>
+        </w:tc>
+        <w:tc>
+          <w:tcPr>
+            <w:tcW w:type="dxa" w:w="6890"/>
+            <w:tcBorders>
+              <w:top w:val="single" w:color="D1D5DB" w:sz="2"/>
+              <w:left w:val="single" w:color="D1D5DB" w:sz="2"/>
+              <w:bottom w:val="single" w:color="D1D5DB" w:sz="2"/>
+              <w:right w:val="single" w:color="D1D5DB" w:sz="2"/>
+            </w:tcBorders>
             <w:tcMar>
               <w:top w:type="dxa" w:w="100"/>
               <w:left w:type="dxa" w:w="140"/>
@@ -557,73 +625,69 @@
                 <w:sz w:val="20"/>
                 <w:szCs w:val="20"/>
               </w:rPr>
-              <w:t xml:space="preserve">Podés editar el stock de un producto directamente desde el listado, sin abrir formularios.</w:t>
-            </w:r>
-          </w:p>
-        </w:tc>
-      </w:tr>
-      <w:tr>
-        <w:tc>
-          <w:tcPr>
-            <w:tcW w:type="dxa" w:w="2950"/>
-            <w:tcBorders>
-              <w:top w:val="single" w:color="D1D5DB" w:sz="2"/>
-              <w:left w:val="single" w:color="D1D5DB" w:sz="2"/>
-              <w:bottom w:val="single" w:color="D1D5DB" w:sz="2"/>
-              <w:right w:val="single" w:color="D1D5DB" w:sz="2"/>
-            </w:tcBorders>
-            <w:tcMar>
-              <w:top w:type="dxa" w:w="100"/>
-              <w:left w:type="dxa" w:w="140"/>
-              <w:bottom w:type="dxa" w:w="100"/>
-              <w:right w:type="dxa" w:w="140"/>
-            </w:tcMar>
-          </w:tcPr>
-          <w:p>
-            <w:pPr>
-              <w:spacing w:line="280"/>
-            </w:pPr>
-            <w:r>
-              <w:rPr>
-                <w:b/>
-                <w:bCs/>
-                <w:color w:val="111827"/>
-                <w:sz w:val="20"/>
-                <w:szCs w:val="20"/>
-              </w:rPr>
-              <w:t xml:space="preserve">Buscador interno</w:t>
-            </w:r>
-          </w:p>
-        </w:tc>
-        <w:tc>
-          <w:tcPr>
-            <w:tcW w:type="dxa" w:w="6890"/>
-            <w:tcBorders>
-              <w:top w:val="single" w:color="D1D5DB" w:sz="2"/>
-              <w:left w:val="single" w:color="D1D5DB" w:sz="2"/>
-              <w:bottom w:val="single" w:color="D1D5DB" w:sz="2"/>
-              <w:right w:val="single" w:color="D1D5DB" w:sz="2"/>
-            </w:tcBorders>
-            <w:tcMar>
-              <w:top w:type="dxa" w:w="100"/>
-              <w:left w:type="dxa" w:w="140"/>
-              <w:bottom w:type="dxa" w:w="100"/>
-              <w:right w:type="dxa" w:w="140"/>
-            </w:tcMar>
-          </w:tcPr>
-          <w:p>
-            <w:pPr>
-              <w:spacing w:line="280"/>
-            </w:pPr>
-            <w:r>
-              <w:rPr>
-                <w:b w:val="false"/>
-                <w:bCs w:val="false"/>
-                <w:color w:val="374151"/>
-                <w:sz w:val="20"/>
-                <w:szCs w:val="20"/>
-              </w:rPr>
               <w:t xml:space="preserve">Encontrá cualquier producto por nombre, código o marca en segundos.</w:t>
+            </w:r>
+          </w:p>
+        </w:tc>
+      </w:tr>
+      <w:tr>
+        <w:tc>
+          <w:tcPr>
+            <w:tcW w:type="dxa" w:w="2950"/>
+            <w:tcBorders>
+              <w:top w:val="single" w:color="D1D5DB" w:sz="2"/>
+              <w:left w:val="single" w:color="D1D5DB" w:sz="2"/>
+              <w:bottom w:val="single" w:color="D1D5DB" w:sz="2"/>
+              <w:right w:val="single" w:color="D1D5DB" w:sz="2"/>
+            </w:tcBorders>
+            <w:shd w:fill="F9FAFB" w:val="clear"/>
+            <w:tcMar>
+              <w:top w:type="dxa" w:w="100"/>
+              <w:left w:type="dxa" w:w="140"/>
+              <w:bottom w:type="dxa" w:w="100"/>
+              <w:right w:type="dxa" w:w="140"/>
+            </w:tcMar>
+          </w:tcPr>
+          <w:p>
+            <w:pPr>
+              <w:spacing w:line="280"/>
+            </w:pPr>
+            <w:r>
+              <w:rPr>
+                <w:b/>
+                <w:sz w:val="21"/>
+              </w:rPr>
+              <w:t>Tipo de IVA por producto</w:t>
+            </w:r>
+          </w:p>
+        </w:tc>
+        <w:tc>
+          <w:tcPr>
+            <w:tcW w:type="dxa" w:w="6890"/>
+            <w:tcBorders>
+              <w:top w:val="single" w:color="D1D5DB" w:sz="2"/>
+              <w:left w:val="single" w:color="D1D5DB" w:sz="2"/>
+              <w:bottom w:val="single" w:color="D1D5DB" w:sz="2"/>
+              <w:right w:val="single" w:color="D1D5DB" w:sz="2"/>
+            </w:tcBorders>
+            <w:shd w:fill="F9FAFB" w:val="clear"/>
+            <w:tcMar>
+              <w:top w:type="dxa" w:w="100"/>
+              <w:left w:type="dxa" w:w="140"/>
+              <w:bottom w:type="dxa" w:w="100"/>
+              <w:right w:type="dxa" w:w="140"/>
+            </w:tcMar>
+          </w:tcPr>
+          <w:p>
+            <w:pPr>
+              <w:spacing w:line="280"/>
+            </w:pPr>
+            <w:r>
+              <w:rPr>
+                <w:b w:val="0"/>
+                <w:sz w:val="21"/>
+              </w:rPr>
+              <w:t>A cada producto le asignás si tiene IVA Básica (22%) o Mínima (10%). El precio que cargás ya es el precio final que le cobrás al cliente (con el IVA incluido) — el tipo de IVA no se suma al precio, solo se usa para mostrar la etiqueta correspondiente y discriminarlo en el comprobante.</w:t>
             </w:r>
           </w:p>
         </w:tc>
@@ -822,12 +886,9 @@
             <w:r>
               <w:rPr>
                 <w:b/>
-                <w:bCs/>
-                <w:color w:val="111827"/>
-                <w:sz w:val="20"/>
-                <w:szCs w:val="20"/>
-              </w:rPr>
-              <w:t xml:space="preserve">Control total de acceso</w:t>
+                <w:sz w:val="21"/>
+              </w:rPr>
+              <w:t>Control total de acceso</w:t>
             </w:r>
           </w:p>
         </w:tc>
@@ -854,13 +915,10 @@
             </w:pPr>
             <w:r>
               <w:rPr>
-                <w:b w:val="false"/>
-                <w:bCs w:val="false"/>
-                <w:color w:val="374151"/>
-                <w:sz w:val="20"/>
-                <w:szCs w:val="20"/>
-              </w:rPr>
-              <w:t xml:space="preserve">Solo los clientes que vos das de alta pueden ver tu catálogo. Podés reenviar el código de acceso a un cliente en cualquier momento.</w:t>
+                <w:b w:val="0"/>
+                <w:sz w:val="21"/>
+              </w:rPr>
+              <w:t>Solo los clientes que vos das de alta pueden ver tu catálogo. Podés reenviar el código de acceso a un cliente en cualquier momento, o desactivarlo — si un cliente desactivado te hace un pedido igual, se reactiva automáticamente.</w:t>
             </w:r>
           </w:p>
         </w:tc>
@@ -1192,44 +1250,38 @@
             <w:r>
               <w:rPr>
                 <w:b/>
-                <w:bCs/>
-                <w:color w:val="111827"/>
-                <w:sz w:val="20"/>
-                <w:szCs w:val="20"/>
-              </w:rPr>
-              <w:t xml:space="preserve">Comprobante en PDF</w:t>
-            </w:r>
-          </w:p>
-        </w:tc>
-        <w:tc>
-          <w:tcPr>
-            <w:tcW w:type="dxa" w:w="6890"/>
-            <w:tcBorders>
-              <w:top w:val="single" w:color="D1D5DB" w:sz="2"/>
-              <w:left w:val="single" w:color="D1D5DB" w:sz="2"/>
-              <w:bottom w:val="single" w:color="D1D5DB" w:sz="2"/>
-              <w:right w:val="single" w:color="D1D5DB" w:sz="2"/>
-            </w:tcBorders>
-            <w:tcMar>
-              <w:top w:type="dxa" w:w="100"/>
-              <w:left w:type="dxa" w:w="140"/>
-              <w:bottom w:type="dxa" w:w="100"/>
-              <w:right w:type="dxa" w:w="140"/>
-            </w:tcMar>
-          </w:tcPr>
-          <w:p>
-            <w:pPr>
-              <w:spacing w:line="280"/>
-            </w:pPr>
-            <w:r>
-              <w:rPr>
-                <w:b w:val="false"/>
-                <w:bCs w:val="false"/>
-                <w:color w:val="374151"/>
-                <w:sz w:val="20"/>
-                <w:szCs w:val="20"/>
-              </w:rPr>
-              <w:t xml:space="preserve">Generás e imprimís el comprobante de cada pedido con un clic, y se le envía automáticamente por email al cliente si tiene correo cargado.</w:t>
+                <w:sz w:val="21"/>
+              </w:rPr>
+              <w:t>Comprobante en PDF</w:t>
+            </w:r>
+          </w:p>
+        </w:tc>
+        <w:tc>
+          <w:tcPr>
+            <w:tcW w:type="dxa" w:w="6890"/>
+            <w:tcBorders>
+              <w:top w:val="single" w:color="D1D5DB" w:sz="2"/>
+              <w:left w:val="single" w:color="D1D5DB" w:sz="2"/>
+              <w:bottom w:val="single" w:color="D1D5DB" w:sz="2"/>
+              <w:right w:val="single" w:color="D1D5DB" w:sz="2"/>
+            </w:tcBorders>
+            <w:tcMar>
+              <w:top w:type="dxa" w:w="100"/>
+              <w:left w:type="dxa" w:w="140"/>
+              <w:bottom w:type="dxa" w:w="100"/>
+              <w:right w:type="dxa" w:w="140"/>
+            </w:tcMar>
+          </w:tcPr>
+          <w:p>
+            <w:pPr>
+              <w:spacing w:line="280"/>
+            </w:pPr>
+            <w:r>
+              <w:rPr>
+                <w:b w:val="0"/>
+                <w:sz w:val="21"/>
+              </w:rPr>
+              <w:t>Generás e imprimís el comprobante de cada pedido con un clic, y se le envía automáticamente por email al cliente si tiene correo cargado. El comprobante detalla cada producto con su precio, cantidad y tasa de IVA, y discrimina al final cuánto IVA (Básica 22% / Mínima 10%) está contenido en el total.</w:t>
             </w:r>
           </w:p>
         </w:tc>
@@ -1471,6 +1523,66 @@
           </w:p>
         </w:tc>
       </w:tr>
+      <w:tr>
+        <w:tc>
+          <w:tcPr>
+            <w:tcW w:type="dxa" w:w="2950"/>
+            <w:tcBorders>
+              <w:top w:val="single" w:color="D1D5DB" w:sz="2"/>
+              <w:left w:val="single" w:color="D1D5DB" w:sz="2"/>
+              <w:bottom w:val="single" w:color="D1D5DB" w:sz="2"/>
+              <w:right w:val="single" w:color="D1D5DB" w:sz="2"/>
+            </w:tcBorders>
+            <w:tcMar>
+              <w:top w:type="dxa" w:w="100"/>
+              <w:left w:type="dxa" w:w="140"/>
+              <w:bottom w:type="dxa" w:w="100"/>
+              <w:right w:type="dxa" w:w="140"/>
+            </w:tcMar>
+          </w:tcPr>
+          <w:p>
+            <w:pPr>
+              <w:spacing w:line="280"/>
+            </w:pPr>
+            <w:r>
+              <w:rPr>
+                <w:b/>
+                <w:sz w:val="21"/>
+              </w:rPr>
+              <w:t>Eliminar notificaciones</w:t>
+            </w:r>
+          </w:p>
+        </w:tc>
+        <w:tc>
+          <w:tcPr>
+            <w:tcW w:type="dxa" w:w="6890"/>
+            <w:tcBorders>
+              <w:top w:val="single" w:color="D1D5DB" w:sz="2"/>
+              <w:left w:val="single" w:color="D1D5DB" w:sz="2"/>
+              <w:bottom w:val="single" w:color="D1D5DB" w:sz="2"/>
+              <w:right w:val="single" w:color="D1D5DB" w:sz="2"/>
+            </w:tcBorders>
+            <w:tcMar>
+              <w:top w:type="dxa" w:w="100"/>
+              <w:left w:type="dxa" w:w="140"/>
+              <w:bottom w:type="dxa" w:w="100"/>
+              <w:right w:type="dxa" w:w="140"/>
+            </w:tcMar>
+          </w:tcPr>
+          <w:p>
+            <w:pPr>
+              <w:spacing w:line="280"/>
+            </w:pPr>
+            <w:r>
+              <w:rPr>
+                <w:b w:val="0"/>
+                <w:sz w:val="21"/>
+              </w:rPr>
+              <w:t>Podés eliminar cualquier notificación una vez que la leíste, para mantener la bandeja ordenada.</w:t>
+            </w:r>
+          </w:p>
+        </w:tc>
+      </w:tr>
     </w:tbl>
     <w:p>
       <w:pPr>
@@ -1799,12 +1911,9 @@
             <w:r>
               <w:rPr>
                 <w:b/>
-                <w:bCs/>
-                <w:color w:val="111827"/>
-                <w:sz w:val="20"/>
-                <w:szCs w:val="20"/>
-              </w:rPr>
-              <w:t xml:space="preserve">Tu contraseña</w:t>
+                <w:sz w:val="21"/>
+              </w:rPr>
+              <w:t>Tu contraseña</w:t>
             </w:r>
           </w:p>
         </w:tc>
@@ -1831,13 +1940,70 @@
             </w:pPr>
             <w:r>
               <w:rPr>
-                <w:b w:val="false"/>
-                <w:bCs w:val="false"/>
-                <w:color w:val="374151"/>
-                <w:sz w:val="20"/>
-                <w:szCs w:val="20"/>
-              </w:rPr>
-              <w:t xml:space="preserve">Podés cambiarla cuando quieras desde la misma pantalla.</w:t>
+                <w:b w:val="0"/>
+                <w:sz w:val="21"/>
+              </w:rPr>
+              <w:t>Podés cambiarla cuando quieras desde la misma pantalla. Si la olvidás, desde la pantalla de inicio de sesión podés pedir que te llegue un enlace de recuperación a tu email para restablecerla vos mismo, sin necesitar ayuda de soporte.</w:t>
+            </w:r>
+          </w:p>
+        </w:tc>
+      </w:tr>
+      <w:tr>
+        <w:tc>
+          <w:tcPr>
+            <w:tcW w:type="dxa" w:w="2950"/>
+            <w:tcBorders>
+              <w:top w:val="single" w:color="D1D5DB" w:sz="2"/>
+              <w:left w:val="single" w:color="D1D5DB" w:sz="2"/>
+              <w:bottom w:val="single" w:color="D1D5DB" w:sz="2"/>
+              <w:right w:val="single" w:color="D1D5DB" w:sz="2"/>
+            </w:tcBorders>
+            <w:tcMar>
+              <w:top w:type="dxa" w:w="100"/>
+              <w:left w:type="dxa" w:w="140"/>
+              <w:bottom w:type="dxa" w:w="100"/>
+              <w:right w:type="dxa" w:w="140"/>
+            </w:tcMar>
+          </w:tcPr>
+          <w:p>
+            <w:pPr>
+              <w:spacing w:line="280"/>
+            </w:pPr>
+            <w:r>
+              <w:rPr>
+                <w:b/>
+                <w:sz w:val="21"/>
+              </w:rPr>
+              <w:t>Pagar tu suscripción</w:t>
+            </w:r>
+          </w:p>
+        </w:tc>
+        <w:tc>
+          <w:tcPr>
+            <w:tcW w:type="dxa" w:w="6890"/>
+            <w:tcBorders>
+              <w:top w:val="single" w:color="D1D5DB" w:sz="2"/>
+              <w:left w:val="single" w:color="D1D5DB" w:sz="2"/>
+              <w:bottom w:val="single" w:color="D1D5DB" w:sz="2"/>
+              <w:right w:val="single" w:color="D1D5DB" w:sz="2"/>
+            </w:tcBorders>
+            <w:tcMar>
+              <w:top w:type="dxa" w:w="100"/>
+              <w:left w:type="dxa" w:w="140"/>
+              <w:bottom w:type="dxa" w:w="100"/>
+              <w:right w:type="dxa" w:w="140"/>
+            </w:tcMar>
+          </w:tcPr>
+          <w:p>
+            <w:pPr>
+              <w:spacing w:line="280"/>
+            </w:pPr>
+            <w:r>
+              <w:rPr>
+                <w:b w:val="0"/>
+                <w:sz w:val="21"/>
+              </w:rPr>
+              <w:t>Ves el estado de tu suscripción (prueba gratuita, activa o vencida) y podés pagar o renovar directamente con MercadoPago desde la misma pantalla, o coordinar el pago manualmente con nosotros. Si la suscripción vence y no se regulariza, tu acceso al panel se bloquea y tu catálogo deja de estar disponible para tus clientes hasta que se regularice.</w:t>
             </w:r>
           </w:p>
         </w:tc>
@@ -1980,24 +2146,86 @@
             <w:r>
               <w:rPr>
                 <w:b/>
+                <w:sz w:val="21"/>
+              </w:rPr>
+              <w:t>Ver tu catálogo actualizado</w:t>
+            </w:r>
+          </w:p>
+        </w:tc>
+        <w:tc>
+          <w:tcPr>
+            <w:tcW w:type="dxa" w:w="6890"/>
+            <w:tcBorders>
+              <w:top w:val="single" w:color="D1D5DB" w:sz="2"/>
+              <w:left w:val="single" w:color="D1D5DB" w:sz="2"/>
+              <w:bottom w:val="single" w:color="D1D5DB" w:sz="2"/>
+              <w:right w:val="single" w:color="D1D5DB" w:sz="2"/>
+            </w:tcBorders>
+            <w:tcMar>
+              <w:top w:type="dxa" w:w="100"/>
+              <w:left w:type="dxa" w:w="140"/>
+              <w:bottom w:type="dxa" w:w="100"/>
+              <w:right w:type="dxa" w:w="140"/>
+            </w:tcMar>
+          </w:tcPr>
+          <w:p>
+            <w:pPr>
+              <w:spacing w:line="280"/>
+            </w:pPr>
+            <w:r>
+              <w:rPr>
+                <w:b w:val="0"/>
+                <w:sz w:val="21"/>
+              </w:rPr>
+              <w:t>Con el stock disponible en tiempo real, y pueden buscar y filtrar por nombre, categoría o marca. Cada producto muestra si tiene IVA Básica (22%) o Mínima (10%) incluido en el precio.</w:t>
+            </w:r>
+          </w:p>
+        </w:tc>
+      </w:tr>
+      <w:tr>
+        <w:tc>
+          <w:tcPr>
+            <w:tcW w:type="dxa" w:w="2950"/>
+            <w:tcBorders>
+              <w:top w:val="single" w:color="D1D5DB" w:sz="2"/>
+              <w:left w:val="single" w:color="D1D5DB" w:sz="2"/>
+              <w:bottom w:val="single" w:color="D1D5DB" w:sz="2"/>
+              <w:right w:val="single" w:color="D1D5DB" w:sz="2"/>
+            </w:tcBorders>
+            <w:shd w:fill="F9FAFB" w:val="clear"/>
+            <w:tcMar>
+              <w:top w:type="dxa" w:w="100"/>
+              <w:left w:type="dxa" w:w="140"/>
+              <w:bottom w:type="dxa" w:w="100"/>
+              <w:right w:type="dxa" w:w="140"/>
+            </w:tcMar>
+          </w:tcPr>
+          <w:p>
+            <w:pPr>
+              <w:spacing w:line="280"/>
+            </w:pPr>
+            <w:r>
+              <w:rPr>
+                <w:b/>
                 <w:bCs/>
                 <w:color w:val="111827"/>
                 <w:sz w:val="20"/>
                 <w:szCs w:val="20"/>
               </w:rPr>
-              <w:t xml:space="preserve">Ver tu catálogo actualizado</w:t>
-            </w:r>
-          </w:p>
-        </w:tc>
-        <w:tc>
-          <w:tcPr>
-            <w:tcW w:type="dxa" w:w="6890"/>
-            <w:tcBorders>
-              <w:top w:val="single" w:color="D1D5DB" w:sz="2"/>
-              <w:left w:val="single" w:color="D1D5DB" w:sz="2"/>
-              <w:bottom w:val="single" w:color="D1D5DB" w:sz="2"/>
-              <w:right w:val="single" w:color="D1D5DB" w:sz="2"/>
-            </w:tcBorders>
+              <w:t xml:space="preserve">Ver su precio personalizado</w:t>
+            </w:r>
+          </w:p>
+        </w:tc>
+        <w:tc>
+          <w:tcPr>
+            <w:tcW w:type="dxa" w:w="6890"/>
+            <w:tcBorders>
+              <w:top w:val="single" w:color="D1D5DB" w:sz="2"/>
+              <w:left w:val="single" w:color="D1D5DB" w:sz="2"/>
+              <w:bottom w:val="single" w:color="D1D5DB" w:sz="2"/>
+              <w:right w:val="single" w:color="D1D5DB" w:sz="2"/>
+            </w:tcBorders>
+            <w:shd w:fill="F9FAFB" w:val="clear"/>
             <w:tcMar>
               <w:top w:type="dxa" w:w="100"/>
               <w:left w:type="dxa" w:w="140"/>
@@ -2017,7 +2245,67 @@
                 <w:sz w:val="20"/>
                 <w:szCs w:val="20"/>
               </w:rPr>
-              <w:t xml:space="preserve">Con el stock disponible en tiempo real, y pueden buscar y filtrar por nombre, categoría o marca.</w:t>
+              <w:t xml:space="preserve">Si le asignaste un descuento a ese cliente en algún producto, lo ve reflejado automáticamente junto al precio de lista.</w:t>
+            </w:r>
+          </w:p>
+        </w:tc>
+      </w:tr>
+      <w:tr>
+        <w:tc>
+          <w:tcPr>
+            <w:tcW w:type="dxa" w:w="2950"/>
+            <w:tcBorders>
+              <w:top w:val="single" w:color="D1D5DB" w:sz="2"/>
+              <w:left w:val="single" w:color="D1D5DB" w:sz="2"/>
+              <w:bottom w:val="single" w:color="D1D5DB" w:sz="2"/>
+              <w:right w:val="single" w:color="D1D5DB" w:sz="2"/>
+            </w:tcBorders>
+            <w:tcMar>
+              <w:top w:type="dxa" w:w="100"/>
+              <w:left w:type="dxa" w:w="140"/>
+              <w:bottom w:type="dxa" w:w="100"/>
+              <w:right w:type="dxa" w:w="140"/>
+            </w:tcMar>
+          </w:tcPr>
+          <w:p>
+            <w:pPr>
+              <w:spacing w:line="280"/>
+            </w:pPr>
+            <w:r>
+              <w:rPr>
+                <w:b/>
+                <w:sz w:val="21"/>
+              </w:rPr>
+              <w:t>Armar su pedido y confirmarlo</w:t>
+            </w:r>
+          </w:p>
+        </w:tc>
+        <w:tc>
+          <w:tcPr>
+            <w:tcW w:type="dxa" w:w="6890"/>
+            <w:tcBorders>
+              <w:top w:val="single" w:color="D1D5DB" w:sz="2"/>
+              <w:left w:val="single" w:color="D1D5DB" w:sz="2"/>
+              <w:bottom w:val="single" w:color="D1D5DB" w:sz="2"/>
+              <w:right w:val="single" w:color="D1D5DB" w:sz="2"/>
+            </w:tcBorders>
+            <w:tcMar>
+              <w:top w:type="dxa" w:w="100"/>
+              <w:left w:type="dxa" w:w="140"/>
+              <w:bottom w:type="dxa" w:w="100"/>
+              <w:right w:type="dxa" w:w="140"/>
+            </w:tcMar>
+          </w:tcPr>
+          <w:p>
+            <w:pPr>
+              <w:spacing w:line="280"/>
+            </w:pPr>
+            <w:r>
+              <w:rPr>
+                <w:b w:val="0"/>
+                <w:sz w:val="21"/>
+              </w:rPr>
+              <w:t>Agregan productos a un carrito y confirman el pedido, que te llega directo a vos sin intermediarios. Al confirmar, ven en pantalla (e imprimir si quieren) el detalle completo del pedido: productos, cantidades, precios y el desglose de IVA — no solo el total.</w:t>
             </w:r>
           </w:p>
         </w:tc>
@@ -2052,7 +2340,7 @@
                 <w:sz w:val="20"/>
                 <w:szCs w:val="20"/>
               </w:rPr>
-              <w:t xml:space="preserve">Ver su precio personalizado</w:t>
+              <w:t xml:space="preserve">Ver el historial de sus pedidos</w:t>
             </w:r>
           </w:p>
         </w:tc>
@@ -2085,7 +2373,7 @@
                 <w:sz w:val="20"/>
                 <w:szCs w:val="20"/>
               </w:rPr>
-              <w:t xml:space="preserve">Si le asignaste un descuento a ese cliente en algún producto, lo ve reflejado automáticamente junto al precio de lista.</w:t>
+              <w:t xml:space="preserve">Consultan en "Mis Pedidos" el estado y el detalle de todo lo que te compraron antes.</w:t>
             </w:r>
           </w:p>
         </w:tc>
@@ -2119,7 +2407,7 @@
                 <w:sz w:val="20"/>
                 <w:szCs w:val="20"/>
               </w:rPr>
-              <w:t xml:space="preserve">Armar su pedido y confirmarlo</w:t>
+              <w:t xml:space="preserve">Guardar su acceso</w:t>
             </w:r>
           </w:p>
         </w:tc>
@@ -2151,7 +2439,7 @@
                 <w:sz w:val="20"/>
                 <w:szCs w:val="20"/>
               </w:rPr>
-              <w:t xml:space="preserve">Agregan productos a un carrito y confirman el pedido, que te llega directo a vos sin intermediarios.</w:t>
+              <w:t xml:space="preserve">Una vez que ingresan su código la primera vez, no tienen que volver a escribirlo — y si son clientes de más de una distribuidora, pueden cambiar entre ellas sin perder ningún acceso.</w:t>
             </w:r>
           </w:p>
         </w:tc>
@@ -2181,12 +2469,9 @@
             <w:r>
               <w:rPr>
                 <w:b/>
-                <w:bCs/>
-                <w:color w:val="111827"/>
-                <w:sz w:val="20"/>
-                <w:szCs w:val="20"/>
-              </w:rPr>
-              <w:t xml:space="preserve">Ver el historial de sus pedidos</w:t>
+                <w:sz w:val="21"/>
+              </w:rPr>
+              <w:t>Consultar por WhatsApp</w:t>
             </w:r>
           </w:p>
         </w:tc>
@@ -2213,79 +2498,10 @@
             </w:pPr>
             <w:r>
               <w:rPr>
-                <w:b w:val="false"/>
-                <w:bCs w:val="false"/>
-                <w:color w:val="374151"/>
-                <w:sz w:val="20"/>
-                <w:szCs w:val="20"/>
-              </w:rPr>
-              <w:t xml:space="preserve">Consultan en "Mis Pedidos" el estado y el detalle de todo lo que te compraron antes.</w:t>
-            </w:r>
-          </w:p>
-        </w:tc>
-      </w:tr>
-      <w:tr>
-        <w:tc>
-          <w:tcPr>
-            <w:tcW w:type="dxa" w:w="2950"/>
-            <w:tcBorders>
-              <w:top w:val="single" w:color="D1D5DB" w:sz="2"/>
-              <w:left w:val="single" w:color="D1D5DB" w:sz="2"/>
-              <w:bottom w:val="single" w:color="D1D5DB" w:sz="2"/>
-              <w:right w:val="single" w:color="D1D5DB" w:sz="2"/>
-            </w:tcBorders>
-            <w:tcMar>
-              <w:top w:type="dxa" w:w="100"/>
-              <w:left w:type="dxa" w:w="140"/>
-              <w:bottom w:type="dxa" w:w="100"/>
-              <w:right w:type="dxa" w:w="140"/>
-            </w:tcMar>
-          </w:tcPr>
-          <w:p>
-            <w:pPr>
-              <w:spacing w:line="280"/>
-            </w:pPr>
-            <w:r>
-              <w:rPr>
-                <w:b/>
-                <w:bCs/>
-                <w:color w:val="111827"/>
-                <w:sz w:val="20"/>
-                <w:szCs w:val="20"/>
-              </w:rPr>
-              <w:t xml:space="preserve">Guardar su acceso</w:t>
-            </w:r>
-          </w:p>
-        </w:tc>
-        <w:tc>
-          <w:tcPr>
-            <w:tcW w:type="dxa" w:w="6890"/>
-            <w:tcBorders>
-              <w:top w:val="single" w:color="D1D5DB" w:sz="2"/>
-              <w:left w:val="single" w:color="D1D5DB" w:sz="2"/>
-              <w:bottom w:val="single" w:color="D1D5DB" w:sz="2"/>
-              <w:right w:val="single" w:color="D1D5DB" w:sz="2"/>
-            </w:tcBorders>
-            <w:tcMar>
-              <w:top w:type="dxa" w:w="100"/>
-              <w:left w:type="dxa" w:w="140"/>
-              <w:bottom w:type="dxa" w:w="100"/>
-              <w:right w:type="dxa" w:w="140"/>
-            </w:tcMar>
-          </w:tcPr>
-          <w:p>
-            <w:pPr>
-              <w:spacing w:line="280"/>
-            </w:pPr>
-            <w:r>
-              <w:rPr>
-                <w:b w:val="false"/>
-                <w:bCs w:val="false"/>
-                <w:color w:val="374151"/>
-                <w:sz w:val="20"/>
-                <w:szCs w:val="20"/>
-              </w:rPr>
-              <w:t xml:space="preserve">Una vez que ingresan su código la primera vez, no tienen que volver a escribirlo — y si son clientes de más de una distribuidora, pueden cambiar entre ellas sin perder ningún acceso.</w:t>
+                <w:b w:val="0"/>
+                <w:sz w:val="21"/>
+              </w:rPr>
+              <w:t>Además del catálogo, tienen un botón para escribirte por WhatsApp ante alguna consulta puntual — no lo usan para hacer pedidos, eso sigue yendo por el catálogo.</w:t>
             </w:r>
           </w:p>
         </w:tc>
@@ -2672,6 +2888,66 @@
           </w:p>
         </w:tc>
       </w:tr>
+      <w:tr>
+        <w:tc>
+          <w:tcPr>
+            <w:tcW w:type="dxa" w:w="2950"/>
+            <w:tcBorders>
+              <w:top w:val="single" w:color="D1D5DB" w:sz="2"/>
+              <w:left w:val="single" w:color="D1D5DB" w:sz="2"/>
+              <w:bottom w:val="single" w:color="D1D5DB" w:sz="2"/>
+              <w:right w:val="single" w:color="D1D5DB" w:sz="2"/>
+            </w:tcBorders>
+            <w:tcMar>
+              <w:top w:type="dxa" w:w="100"/>
+              <w:left w:type="dxa" w:w="140"/>
+              <w:bottom w:type="dxa" w:w="100"/>
+              <w:right w:type="dxa" w:w="140"/>
+            </w:tcMar>
+          </w:tcPr>
+          <w:p>
+            <w:pPr>
+              <w:spacing w:line="280"/>
+            </w:pPr>
+            <w:r>
+              <w:rPr>
+                <w:b/>
+                <w:sz w:val="21"/>
+              </w:rPr>
+              <w:t>Protección ante intentos de acceso sospechosos</w:t>
+            </w:r>
+          </w:p>
+        </w:tc>
+        <w:tc>
+          <w:tcPr>
+            <w:tcW w:type="dxa" w:w="6890"/>
+            <w:tcBorders>
+              <w:top w:val="single" w:color="D1D5DB" w:sz="2"/>
+              <w:left w:val="single" w:color="D1D5DB" w:sz="2"/>
+              <w:bottom w:val="single" w:color="D1D5DB" w:sz="2"/>
+              <w:right w:val="single" w:color="D1D5DB" w:sz="2"/>
+            </w:tcBorders>
+            <w:tcMar>
+              <w:top w:type="dxa" w:w="100"/>
+              <w:left w:type="dxa" w:w="140"/>
+              <w:bottom w:type="dxa" w:w="100"/>
+              <w:right w:type="dxa" w:w="140"/>
+            </w:tcMar>
+          </w:tcPr>
+          <w:p>
+            <w:pPr>
+              <w:spacing w:line="280"/>
+            </w:pPr>
+            <w:r>
+              <w:rPr>
+                <w:b w:val="0"/>
+                <w:sz w:val="21"/>
+              </w:rPr>
+              <w:t>Si se detectan muchos intentos de inicio de sesión seguidos, el sistema los bloquea temporalmente para proteger tu cuenta y la de tus clientes.</w:t>
+            </w:r>
+          </w:p>
+        </w:tc>
+      </w:tr>
     </w:tbl>
     <w:p>
       <w:pPr>
@@ -2697,12 +2973,7 @@
         <w:spacing w:after="140" w:line="300"/>
       </w:pPr>
       <w:r>
-        <w:rPr>
-          <w:color w:val="1F2937"/>
-          <w:sz w:val="21"/>
-          <w:szCs w:val="21"/>
-        </w:rPr>
-        <w:t xml:space="preserve">StockApp tiene un único plan mensual, sin límites de uso: podés cargar todos los productos, clientes y pedidos que necesites mientras estés al día con el pago. Todas las distribuidoras nuevas arrancan con 90 días de prueba gratuita antes de que se les cobre la primera mensualidad.</w:t>
+        <w:t>StockApp tiene un único plan mensual, sin límites de uso: podés cargar todos los productos, clientes y pedidos que necesites mientras estés al día con el pago. Todas las distribuidoras nuevas arrancan con 90 días de prueba gratuita antes de que se les cobre la primera mensualidad. Podés pagar o renovar en cualquier momento desde Configuración (ver más arriba).</w:t>
       </w:r>
     </w:p>
     <w:sectPr>

</xml_diff>